<commit_message>
Fix blank-looking Word cover; add rendered PDF + print source
The Word cover used white text on a shaded navy background, so viewers
that don't render cell shading showed an apparently blank first page.

- Redesign the .docx to dark-on-light everywhere (navy/gold text on
  light backgrounds, light-gold table header) — legible in any viewer,
  even if background shading is dropped. Verified: 0 light-colored text
  runs; 145 text runs / ~5.1k chars present.
- Add creative-package.pdf: a guaranteed-viewable rendering of the same
  package, plus package-print.html (its print source). Verified visually
  (cover + storyboard table + closing all render with correct Arabic).
- README: list all deliverables (docx, pdf, md, html).

Co-Authored-By: Claude Opus 4.8 <noreply@anthropic.com>
Claude-Session: https://claude.ai/code/session_01Bv3Jx6sVGkkx72TtcjZtta
</commit_message>
<xml_diff>
--- a/alfalak-ad/creative-package.docx
+++ b/alfalak-ad/creative-package.docx
@@ -7,19 +7,19 @@
         <w:tblW w:type="auto" w:w="0"/>
         <w:jc w:val="right"/>
         <w:tblBorders>
-          <w:top w:val="none" w:sz="0" w:space="0" w:color="auto"/>
-          <w:left w:val="none" w:sz="0" w:space="0" w:color="auto"/>
-          <w:bottom w:val="none" w:sz="0" w:space="0" w:color="auto"/>
-          <w:right w:val="none" w:sz="0" w:space="0" w:color="auto"/>
-          <w:insideH w:val="none" w:sz="0" w:space="0" w:color="auto"/>
-          <w:insideV w:val="none" w:sz="0" w:space="0" w:color="auto"/>
+          <w:top w:val="single" w:sz="10" w:space="0" w:color="B8892E"/>
+          <w:left w:val="single" w:sz="10" w:space="0" w:color="B8892E"/>
+          <w:bottom w:val="single" w:sz="10" w:space="0" w:color="B8892E"/>
+          <w:right w:val="single" w:sz="10" w:space="0" w:color="B8892E"/>
+          <w:insideH w:val="single" w:sz="10" w:space="0" w:color="B8892E"/>
+          <w:insideV w:val="single" w:sz="10" w:space="0" w:color="B8892E"/>
         </w:tblBorders>
         <w:tblLayout w:type="fixed"/>
         <w:tblCellMar>
-          <w:top w:w="340" w:type="dxa"/>
-          <w:bottom w:w="340" w:type="dxa"/>
-          <w:left w:w="300" w:type="dxa"/>
-          <w:right w:w="300" w:type="dxa"/>
+          <w:top w:w="360" w:type="dxa"/>
+          <w:bottom w:w="360" w:type="dxa"/>
+          <w:left w:w="320" w:type="dxa"/>
+          <w:right w:w="320" w:type="dxa"/>
         </w:tblCellMar>
         <w:tblLook w:firstColumn="1" w:firstRow="1" w:lastColumn="0" w:lastRow="0" w:noHBand="0" w:noVBand="1" w:val="04A0"/>
       </w:tblPr>
@@ -28,12 +28,12 @@
       </w:tblGrid>
       <w:tr>
         <w:trPr>
-          <w:trHeight w:val="14850" w:hRule="atLeast"/>
+          <w:trHeight w:val="14700" w:hRule="atLeast"/>
         </w:trPr>
         <w:tc>
           <w:tcPr>
             <w:tcW w:type="dxa" w:w="10091"/>
-            <w:shd w:fill="0E1A3A" w:val="clear" w:color="auto"/>
+            <w:shd w:fill="FAF5E9" w:val="clear" w:color="auto"/>
             <w:vAlign w:val="center"/>
           </w:tcPr>
           <w:p>
@@ -47,9 +47,9 @@
                 <w:rFonts w:ascii="Tahoma" w:hAnsi="Tahoma" w:cs="Tahoma"/>
                 <w:b w:val="0"/>
                 <w:i w:val="0"/>
-                <w:color w:val="E8C877"/>
-                <w:sz w:val="24"/>
-                <w:szCs w:val="24"/>
+                <w:color w:val="B8892E"/>
+                <w:sz w:val="26"/>
+                <w:szCs w:val="26"/>
                 <w:rtl/>
               </w:rPr>
               <w:t>★   ★   ★</w:t>
@@ -58,7 +58,7 @@
           <w:p>
             <w:pPr>
               <w:bidi/>
-              <w:spacing w:after="120" w:before="0" w:line="324" w:lineRule="auto"/>
+              <w:spacing w:after="160" w:before="0" w:line="324" w:lineRule="auto"/>
               <w:jc w:val="center"/>
             </w:pPr>
             <w:r>
@@ -66,7 +66,7 @@
                 <w:rFonts w:ascii="Tahoma" w:hAnsi="Tahoma" w:cs="Tahoma"/>
                 <w:b/>
                 <w:i w:val="0"/>
-                <w:color w:val="E8C877"/>
+                <w:color w:val="B8892E"/>
                 <w:sz w:val="24"/>
                 <w:szCs w:val="24"/>
                 <w:rtl/>
@@ -85,7 +85,7 @@
                 <w:rFonts w:ascii="Tahoma" w:hAnsi="Tahoma" w:cs="Tahoma"/>
                 <w:b/>
                 <w:i w:val="0"/>
-                <w:color w:val="FFFFFF"/>
+                <w:color w:val="0E1A3A"/>
                 <w:sz w:val="80"/>
                 <w:szCs w:val="80"/>
                 <w:rtl/>
@@ -96,7 +96,7 @@
           <w:p>
             <w:pPr>
               <w:bidi/>
-              <w:spacing w:after="400" w:before="0" w:line="324" w:lineRule="auto"/>
+              <w:spacing w:after="440" w:before="0" w:line="324" w:lineRule="auto"/>
               <w:jc w:val="center"/>
             </w:pPr>
             <w:r>
@@ -104,7 +104,7 @@
                 <w:rFonts w:ascii="Tahoma" w:hAnsi="Tahoma" w:cs="Tahoma"/>
                 <w:b/>
                 <w:i w:val="0"/>
-                <w:color w:val="E8C877"/>
+                <w:color w:val="B8892E"/>
                 <w:sz w:val="34"/>
                 <w:szCs w:val="34"/>
                 <w:rtl/>
@@ -123,7 +123,7 @@
                 <w:rFonts w:ascii="Tahoma" w:hAnsi="Tahoma" w:cs="Tahoma"/>
                 <w:b w:val="0"/>
                 <w:i w:val="0"/>
-                <w:color w:val="D7DEF2"/>
+                <w:color w:val="1B2340"/>
                 <w:sz w:val="25"/>
                 <w:szCs w:val="25"/>
                 <w:rtl/>
@@ -134,7 +134,7 @@
           <w:p>
             <w:pPr>
               <w:bidi/>
-              <w:spacing w:after="480" w:before="0" w:line="360" w:lineRule="auto"/>
+              <w:spacing w:after="520" w:before="0" w:line="360" w:lineRule="auto"/>
               <w:jc w:val="center"/>
             </w:pPr>
             <w:r>
@@ -142,7 +142,7 @@
                 <w:rFonts w:ascii="Tahoma" w:hAnsi="Tahoma" w:cs="Tahoma"/>
                 <w:b w:val="0"/>
                 <w:i w:val="0"/>
-                <w:color w:val="D7DEF2"/>
+                <w:color w:val="1B2340"/>
                 <w:sz w:val="25"/>
                 <w:szCs w:val="25"/>
                 <w:rtl/>
@@ -155,30 +155,30 @@
               <w:tblW w:type="auto" w:w="0"/>
               <w:jc w:val="center"/>
               <w:tblBorders>
-                <w:top w:val="none" w:sz="0" w:space="0" w:color="auto"/>
-                <w:left w:val="none" w:sz="0" w:space="0" w:color="auto"/>
-                <w:bottom w:val="none" w:sz="0" w:space="0" w:color="auto"/>
-                <w:right w:val="none" w:sz="0" w:space="0" w:color="auto"/>
-                <w:insideH w:val="none" w:sz="0" w:space="0" w:color="auto"/>
-                <w:insideV w:val="none" w:sz="0" w:space="0" w:color="auto"/>
+                <w:top w:val="single" w:sz="12" w:space="0" w:color="0E1A3A"/>
+                <w:left w:val="single" w:sz="12" w:space="0" w:color="0E1A3A"/>
+                <w:bottom w:val="single" w:sz="12" w:space="0" w:color="0E1A3A"/>
+                <w:right w:val="single" w:sz="12" w:space="0" w:color="0E1A3A"/>
+                <w:insideH w:val="single" w:sz="12" w:space="0" w:color="0E1A3A"/>
+                <w:insideV w:val="single" w:sz="12" w:space="0" w:color="0E1A3A"/>
               </w:tblBorders>
               <w:tblLayout w:type="fixed"/>
               <w:tblCellMar>
-                <w:top w:w="150" w:type="dxa"/>
-                <w:bottom w:w="150" w:type="dxa"/>
-                <w:left w:w="180" w:type="dxa"/>
-                <w:right w:w="180" w:type="dxa"/>
+                <w:top w:w="160" w:type="dxa"/>
+                <w:bottom w:w="160" w:type="dxa"/>
+                <w:left w:w="190" w:type="dxa"/>
+                <w:right w:w="190" w:type="dxa"/>
               </w:tblCellMar>
               <w:tblLook w:firstColumn="1" w:firstRow="1" w:lastColumn="0" w:lastRow="0" w:noHBand="0" w:noVBand="1" w:val="04A0"/>
             </w:tblPr>
             <w:tblGrid>
-              <w:gridCol w:w="8503"/>
+              <w:gridCol w:w="8617"/>
             </w:tblGrid>
             <w:tr>
               <w:tc>
                 <w:tcPr>
-                  <w:tcW w:type="dxa" w:w="8504"/>
-                  <w:shd w:fill="16244C" w:val="clear" w:color="auto"/>
+                  <w:tcW w:type="dxa" w:w="8617"/>
+                  <w:shd w:fill="EDF0F8" w:val="clear" w:color="auto"/>
                 </w:tcPr>
                 <w:p/>
                 <w:p>
@@ -192,7 +192,7 @@
                       <w:rFonts w:ascii="Tahoma" w:hAnsi="Tahoma" w:cs="Tahoma"/>
                       <w:b/>
                       <w:i w:val="0"/>
-                      <w:color w:val="E8C877"/>
+                      <w:color w:val="B8892E"/>
                       <w:sz w:val="20"/>
                       <w:szCs w:val="20"/>
                       <w:rtl/>
@@ -211,7 +211,7 @@
                       <w:rFonts w:ascii="Tahoma" w:hAnsi="Tahoma" w:cs="Tahoma"/>
                       <w:b/>
                       <w:i w:val="0"/>
-                      <w:color w:val="FFFFFF"/>
+                      <w:color w:val="0E1A3A"/>
                       <w:sz w:val="28"/>
                       <w:szCs w:val="28"/>
                       <w:rtl/>
@@ -226,7 +226,7 @@
           <w:p>
             <w:pPr>
               <w:bidi/>
-              <w:spacing w:after="440" w:before="360" w:line="324" w:lineRule="auto"/>
+              <w:spacing w:after="480" w:before="400" w:line="324" w:lineRule="auto"/>
               <w:jc w:val="center"/>
             </w:pPr>
             <w:r>
@@ -253,7 +253,7 @@
                 <w:rFonts w:ascii="Tahoma" w:hAnsi="Tahoma" w:cs="Tahoma"/>
                 <w:b w:val="0"/>
                 <w:i w:val="0"/>
-                <w:color w:val="C7CFE6"/>
+                <w:color w:val="5B6478"/>
                 <w:sz w:val="22"/>
                 <w:szCs w:val="22"/>
                 <w:rtl/>
@@ -1210,7 +1210,7 @@
         <w:tc>
           <w:tcPr>
             <w:tcW w:type="dxa" w:w="567"/>
-            <w:shd w:fill="0E1A3A" w:val="clear" w:color="auto"/>
+            <w:shd w:fill="EFE3C2" w:val="clear" w:color="auto"/>
             <w:vAlign w:val="center"/>
           </w:tcPr>
           <w:p>
@@ -1224,7 +1224,7 @@
                 <w:rFonts w:ascii="Tahoma" w:hAnsi="Tahoma" w:cs="Tahoma"/>
                 <w:b/>
                 <w:i w:val="0"/>
-                <w:color w:val="FFFFFF"/>
+                <w:color w:val="0E1A3A"/>
                 <w:sz w:val="19"/>
                 <w:szCs w:val="19"/>
                 <w:rtl/>
@@ -1236,7 +1236,7 @@
         <w:tc>
           <w:tcPr>
             <w:tcW w:type="dxa" w:w="2665"/>
-            <w:shd w:fill="0E1A3A" w:val="clear" w:color="auto"/>
+            <w:shd w:fill="EFE3C2" w:val="clear" w:color="auto"/>
             <w:vAlign w:val="center"/>
           </w:tcPr>
           <w:p>
@@ -1250,7 +1250,7 @@
                 <w:rFonts w:ascii="Tahoma" w:hAnsi="Tahoma" w:cs="Tahoma"/>
                 <w:b/>
                 <w:i w:val="0"/>
-                <w:color w:val="FFFFFF"/>
+                <w:color w:val="0E1A3A"/>
                 <w:sz w:val="19"/>
                 <w:szCs w:val="19"/>
                 <w:rtl/>
@@ -1262,7 +1262,7 @@
         <w:tc>
           <w:tcPr>
             <w:tcW w:type="dxa" w:w="3572"/>
-            <w:shd w:fill="0E1A3A" w:val="clear" w:color="auto"/>
+            <w:shd w:fill="EFE3C2" w:val="clear" w:color="auto"/>
             <w:vAlign w:val="center"/>
           </w:tcPr>
           <w:p>
@@ -1276,7 +1276,7 @@
                 <w:rFonts w:ascii="Tahoma" w:hAnsi="Tahoma" w:cs="Tahoma"/>
                 <w:b/>
                 <w:i w:val="0"/>
-                <w:color w:val="FFFFFF"/>
+                <w:color w:val="0E1A3A"/>
                 <w:sz w:val="19"/>
                 <w:szCs w:val="19"/>
                 <w:rtl/>
@@ -1288,7 +1288,7 @@
         <w:tc>
           <w:tcPr>
             <w:tcW w:type="dxa" w:w="2268"/>
-            <w:shd w:fill="0E1A3A" w:val="clear" w:color="auto"/>
+            <w:shd w:fill="EFE3C2" w:val="clear" w:color="auto"/>
             <w:vAlign w:val="center"/>
           </w:tcPr>
           <w:p>
@@ -1302,7 +1302,7 @@
                 <w:rFonts w:ascii="Tahoma" w:hAnsi="Tahoma" w:cs="Tahoma"/>
                 <w:b/>
                 <w:i w:val="0"/>
-                <w:color w:val="FFFFFF"/>
+                <w:color w:val="0E1A3A"/>
                 <w:sz w:val="19"/>
                 <w:szCs w:val="19"/>
                 <w:rtl/>
@@ -1314,7 +1314,7 @@
         <w:tc>
           <w:tcPr>
             <w:tcW w:type="dxa" w:w="1020"/>
-            <w:shd w:fill="0E1A3A" w:val="clear" w:color="auto"/>
+            <w:shd w:fill="EFE3C2" w:val="clear" w:color="auto"/>
             <w:vAlign w:val="center"/>
           </w:tcPr>
           <w:p>
@@ -1328,7 +1328,7 @@
                 <w:rFonts w:ascii="Tahoma" w:hAnsi="Tahoma" w:cs="Tahoma"/>
                 <w:b/>
                 <w:i w:val="0"/>
-                <w:color w:val="FFFFFF"/>
+                <w:color w:val="0E1A3A"/>
                 <w:sz w:val="19"/>
                 <w:szCs w:val="19"/>
                 <w:rtl/>
@@ -3732,17 +3732,17 @@
         <w:tblW w:type="auto" w:w="0"/>
         <w:jc w:val="right"/>
         <w:tblBorders>
-          <w:top w:val="none" w:sz="0" w:space="0" w:color="auto"/>
-          <w:left w:val="none" w:sz="0" w:space="0" w:color="auto"/>
-          <w:bottom w:val="none" w:sz="0" w:space="0" w:color="auto"/>
-          <w:right w:val="none" w:sz="0" w:space="0" w:color="auto"/>
-          <w:insideH w:val="none" w:sz="0" w:space="0" w:color="auto"/>
-          <w:insideV w:val="none" w:sz="0" w:space="0" w:color="auto"/>
+          <w:top w:val="single" w:sz="14" w:space="0" w:color="B8892E"/>
+          <w:left w:val="single" w:sz="14" w:space="0" w:color="B8892E"/>
+          <w:bottom w:val="single" w:sz="14" w:space="0" w:color="B8892E"/>
+          <w:right w:val="single" w:sz="14" w:space="0" w:color="B8892E"/>
+          <w:insideH w:val="single" w:sz="14" w:space="0" w:color="B8892E"/>
+          <w:insideV w:val="single" w:sz="14" w:space="0" w:color="B8892E"/>
         </w:tblBorders>
         <w:tblLayout w:type="fixed"/>
         <w:tblCellMar>
-          <w:top w:w="280" w:type="dxa"/>
-          <w:bottom w:w="280" w:type="dxa"/>
+          <w:top w:w="300" w:type="dxa"/>
+          <w:bottom w:w="300" w:type="dxa"/>
           <w:left w:w="260" w:type="dxa"/>
           <w:right w:w="260" w:type="dxa"/>
         </w:tblCellMar>
@@ -3755,7 +3755,7 @@
         <w:tc>
           <w:tcPr>
             <w:tcW w:type="dxa" w:w="10091"/>
-            <w:shd w:fill="0E1A3A" w:val="clear" w:color="auto"/>
+            <w:shd w:fill="FAF5E9" w:val="clear" w:color="auto"/>
             <w:vAlign w:val="center"/>
           </w:tcPr>
           <w:p/>
@@ -3770,7 +3770,7 @@
                 <w:rFonts w:ascii="Tahoma" w:hAnsi="Tahoma" w:cs="Tahoma"/>
                 <w:b/>
                 <w:i w:val="0"/>
-                <w:color w:val="E8C877"/>
+                <w:color w:val="B8892E"/>
                 <w:sz w:val="32"/>
                 <w:szCs w:val="32"/>
                 <w:rtl/>
@@ -3789,7 +3789,7 @@
                 <w:rFonts w:ascii="Tahoma" w:hAnsi="Tahoma" w:cs="Tahoma"/>
                 <w:b/>
                 <w:i w:val="0"/>
-                <w:color w:val="FFFFFF"/>
+                <w:color w:val="0E1A3A"/>
                 <w:sz w:val="44"/>
                 <w:szCs w:val="44"/>
                 <w:rtl/>
@@ -3808,7 +3808,7 @@
                 <w:rFonts w:ascii="Tahoma" w:hAnsi="Tahoma" w:cs="Tahoma"/>
                 <w:b/>
                 <w:i w:val="0"/>
-                <w:color w:val="E8C877"/>
+                <w:color w:val="B8892E"/>
                 <w:sz w:val="26"/>
                 <w:szCs w:val="26"/>
                 <w:rtl/>
@@ -3827,7 +3827,7 @@
                 <w:rFonts w:ascii="Tahoma" w:hAnsi="Tahoma" w:cs="Tahoma"/>
                 <w:b w:val="0"/>
                 <w:i w:val="0"/>
-                <w:color w:val="C7CFE6"/>
+                <w:color w:val="1B2340"/>
                 <w:sz w:val="23"/>
                 <w:szCs w:val="23"/>
                 <w:rtl/>

</xml_diff>